<commit_message>
Add intent lock-in, EC1 ghost week fix, ETHOS doc, and v1.2 audit fixes
- Intent lock-in (PS2): long-press intent to seal commitment, gold lock icon,
  task inputs frozen, committed boolean in DayData
- EC1 fix: hide StatusLabel entirely when all days are ghost
- F1 fix: wordmark uses fontVariant small-caps (not textTransform uppercase)
- F9 fix: pointerEvents none on disabled cards
- Reduced top padding for iPhone safe area
- Add ETHOS.pdf and updated ARC_MVP.docx
- Updated checklist to v1.2, README link fix
- New VelocityScreen test, updated test fixtures for committed field
- 105 tests pass, build clean

Co-Authored-By: claude-flow <ruv@ruv.net>
</commit_message>
<xml_diff>
--- a/ARC_MVP.docx
+++ b/ARC_MVP.docx
@@ -100,7 +100,7 @@
           <w:sz w:val="22"/>
           <w:szCs w:val="22"/>
         </w:rPr>
-        <w:t xml:space="preserve">Version 1.1 — March 2026</w:t>
+        <w:t xml:space="preserve">Version 1.2 — Final — March 2026</w:t>
       </w:r>
     </w:p>
     <w:p>
@@ -187,7 +187,7 @@
           <w:sz w:val="24"/>
           <w:szCs w:val="24"/>
         </w:rPr>
-        <w:t xml:space="preserve">The system treats your life as three resource channels (Physical, Output, Social) and asks you to do exactly one thing in each per day. No gamification. No streaks. No social feed. Missed days are data, not failure.</w:t>
+        <w:t xml:space="preserve">The system treats your life as three resource channels (Body, Build, Exposure) and asks you to do exactly one thing in each per day. No gamification. No streaks. No social feed. Missed days are data, not failure.</w:t>
       </w:r>
     </w:p>
     <w:p>
@@ -318,6 +318,34 @@
           <w:szCs w:val="24"/>
         </w:rPr>
         <w:t xml:space="preserve">The aesthetic isn’t minimal because minimal is trendy. It’s minimal because excess is noise, and noise is drift. The dark palette, the gold accent, the two-screen limit — these aren’t design choices, they’re philosophical ones. The app should feel like a sharp tool, not a friendly companion.</w:t>
+      </w:r>
+    </w:p>
+    <w:p>
+      <w:pPr>
+        <w:spacing w:before="200" w:after="200"/>
+      </w:pPr>
+      <w:r>
+        <w:rPr>
+          <w:rFonts w:ascii="Arial" w:cs="Arial" w:eastAsia="Arial" w:hAnsi="Arial"/>
+          <w:b/>
+          <w:bCs/>
+          <w:sz w:val="26"/>
+          <w:szCs w:val="26"/>
+        </w:rPr>
+        <w:t xml:space="preserve">The Real Enemy: Narrative Drift</w:t>
+      </w:r>
+    </w:p>
+    <w:p>
+      <w:pPr>
+        <w:spacing w:after="120"/>
+      </w:pPr>
+      <w:r>
+        <w:rPr>
+          <w:rFonts w:ascii="Arial" w:cs="Arial" w:eastAsia="Arial" w:hAnsi="Arial"/>
+          <w:sz w:val="24"/>
+          <w:szCs w:val="24"/>
+        </w:rPr>
+        <w:t xml:space="preserve">People don’t drift because they’re lazy. They drift because the story in their head slowly changes. “I’m just taking a light week.” “I’ll restart next Monday.” Weeks turn into months. ARC interrupts narrative drift with visible data. You cannot argue with the graph. The graph doesn’t care about your story — it shows whether you moved or not.</w:t>
       </w:r>
     </w:p>
     <w:p>
@@ -1069,7 +1097,7 @@
           <w:sz w:val="24"/>
           <w:szCs w:val="24"/>
         </w:rPr>
-        <w:t xml:space="preserve">You wake up. You open ARC. You see today’s date, three empty domain cards, and a blank intent line. You type your intent — one sentence that frames the day. Then you fill in one task per domain: Physical, Output, Social. You close the app. Total time: under 60 seconds.</w:t>
+        <w:t xml:space="preserve">You wake up. You open ARC. You see today’s date, three empty domain cards, and a blank intent line. You type your intent — one sentence that frames the day. Then you fill in one task per domain: Body, Build, Exposure. You close the app. Total time: under 60 seconds.</w:t>
       </w:r>
     </w:p>
     <w:p>
@@ -1525,7 +1553,7 @@
           <w:sz w:val="24"/>
           <w:szCs w:val="24"/>
         </w:rPr>
-        <w:t xml:space="preserve">Physical, Output, Social. Each card has a domain label, editable task text, and a swipe-to-complete gesture.</w:t>
+        <w:t xml:space="preserve">Body, Build, Exposure. Each card has a domain label, editable task text, and a swipe-to-complete gesture.</w:t>
       </w:r>
     </w:p>
     <w:p>
@@ -1812,7 +1840,7 @@
           <w:sz w:val="24"/>
           <w:szCs w:val="24"/>
         </w:rPr>
-        <w:t xml:space="preserve">Below the main graph, three horizontal bars show weekly completion rate per domain (e.g. Physical: 5/7, Output: 3/7, Social: 2/7). This reveals which channel is lagging.</w:t>
+        <w:t xml:space="preserve">Below the main graph, three horizontal bars show weekly completion rate per domain (e.g. Body: 5/7, Build: 3/7, Exposure: 2/7). This reveals which channel is lagging.</w:t>
       </w:r>
     </w:p>
     <w:p>
@@ -2961,6 +2989,27 @@
       </w:r>
     </w:p>
     <w:p>
+      <w:pPr>
+        <w:pStyle w:val="Heading2"/>
+      </w:pPr>
+      <w:r>
+        <w:t xml:space="preserve">Ghost Weeks</w:t>
+      </w:r>
+    </w:p>
+    <w:p>
+      <w:pPr>
+        <w:spacing w:after="120"/>
+      </w:pPr>
+      <w:r>
+        <w:rPr>
+          <w:rFonts w:ascii="Arial" w:cs="Arial" w:eastAsia="Arial" w:hAnsi="Arial"/>
+          <w:sz w:val="24"/>
+          <w:szCs w:val="24"/>
+        </w:rPr>
+        <w:t xml:space="preserve">A ghost week is a week where no localStorage keys exist for any day in the Mon–Sun range. The user never opened the app once. On the velocity screen, a ghost week shows as a completely empty chart with no bars, no outlines, and no status label — just absence. This is visually distinct from a bad week (where bars exist but are low) and needs no special UI treatment beyond what the existing data model already produces.</w:t>
+      </w:r>
+    </w:p>
+    <w:p>
       <w:r>
         <w:br w:type="page"/>
       </w:r>
@@ -2970,7 +3019,143 @@
         <w:pStyle w:val="Heading1"/>
       </w:pPr>
       <w:r>
-        <w:t xml:space="preserve">6. Data &amp; Storage</w:t>
+        <w:t xml:space="preserve">6. Why These Three Domains</w:t>
+      </w:r>
+    </w:p>
+    <w:p>
+      <w:pPr>
+        <w:spacing w:after="120"/>
+      </w:pPr>
+      <w:r>
+        <w:rPr>
+          <w:rFonts w:ascii="Arial" w:cs="Arial" w:eastAsia="Arial" w:hAnsi="Arial"/>
+          <w:sz w:val="24"/>
+          <w:szCs w:val="24"/>
+        </w:rPr>
+        <w:t xml:space="preserve">Body, Build, and Exposure are not arbitrary categories. They are the minimum viable tripod. When one leg disappears, everything tips.</w:t>
+      </w:r>
+    </w:p>
+    <w:p>
+      <w:pPr>
+        <w:spacing w:after="120"/>
+      </w:pPr>
+      <w:r>
+        <w:rPr>
+          <w:rFonts w:ascii="Arial" w:cs="Arial" w:eastAsia="Arial" w:hAnsi="Arial"/>
+          <w:b/>
+          <w:bCs/>
+          <w:sz w:val="24"/>
+          <w:szCs w:val="24"/>
+        </w:rPr>
+        <w:t xml:space="preserve">Body: </w:t>
+      </w:r>
+      <w:r>
+        <w:rPr>
+          <w:rFonts w:ascii="Arial" w:cs="Arial" w:eastAsia="Arial" w:hAnsi="Arial"/>
+          <w:sz w:val="24"/>
+          <w:szCs w:val="24"/>
+        </w:rPr>
+        <w:t xml:space="preserve">When this goes to zero for weeks, energy drops, sleep degrades, mental sharpness fades. Everything else gets harder even though nothing changed about work or relationships. The body is the foundation. When it goes, it takes the other two with it quietly.</w:t>
+      </w:r>
+    </w:p>
+    <w:p>
+      <w:pPr>
+        <w:spacing w:after="120"/>
+      </w:pPr>
+      <w:r>
+        <w:rPr>
+          <w:rFonts w:ascii="Arial" w:cs="Arial" w:eastAsia="Arial" w:hAnsi="Arial"/>
+          <w:b/>
+          <w:bCs/>
+          <w:sz w:val="24"/>
+          <w:szCs w:val="24"/>
+        </w:rPr>
+        <w:t xml:space="preserve">Build: </w:t>
+      </w:r>
+      <w:r>
+        <w:rPr>
+          <w:rFonts w:ascii="Arial" w:cs="Arial" w:eastAsia="Arial" w:hAnsi="Arial"/>
+          <w:sz w:val="24"/>
+          <w:szCs w:val="24"/>
+        </w:rPr>
+        <w:t xml:space="preserve">When this goes to zero, you feel purposeless. You’re healthy, you’re social, but you’re not building anything. Nothing is moving forward. This is the domain most people think of as “productivity” but it’s really about whether your life is going somewhere or just maintaining.</w:t>
+      </w:r>
+    </w:p>
+    <w:p>
+      <w:pPr>
+        <w:spacing w:after="120"/>
+      </w:pPr>
+      <w:r>
+        <w:rPr>
+          <w:rFonts w:ascii="Arial" w:cs="Arial" w:eastAsia="Arial" w:hAnsi="Arial"/>
+          <w:b/>
+          <w:bCs/>
+          <w:sz w:val="24"/>
+          <w:szCs w:val="24"/>
+        </w:rPr>
+        <w:t xml:space="preserve">Exposure: </w:t>
+      </w:r>
+      <w:r>
+        <w:rPr>
+          <w:rFonts w:ascii="Arial" w:cs="Arial" w:eastAsia="Arial" w:hAnsi="Arial"/>
+          <w:sz w:val="24"/>
+          <w:szCs w:val="24"/>
+        </w:rPr>
+        <w:t xml:space="preserve">When this goes to zero, your world shrinks. You lose perspective. Problems feel bigger than they are because you have no external input. You stop being accountable to anyone. This is the domain people cut first and notice last.</w:t>
+      </w:r>
+    </w:p>
+    <w:p>
+      <w:pPr>
+        <w:spacing w:after="0"/>
+      </w:pPr>
+    </w:p>
+    <w:p>
+      <w:pPr>
+        <w:spacing w:after="120"/>
+      </w:pPr>
+      <w:r>
+        <w:rPr>
+          <w:rFonts w:ascii="Arial" w:cs="Arial" w:eastAsia="Arial" w:hAnsi="Arial"/>
+          <w:sz w:val="24"/>
+          <w:szCs w:val="24"/>
+        </w:rPr>
+        <w:t xml:space="preserve">These three don’t overlap. Most people naturally prioritize one or two and let the third quietly disappear. That’s drift — not across all of life, but in the one channel you’re not watching.</w:t>
+      </w:r>
+    </w:p>
+    <w:p>
+      <w:pPr>
+        <w:spacing w:after="120"/>
+      </w:pPr>
+      <w:r>
+        <w:rPr>
+          <w:rFonts w:ascii="Arial" w:cs="Arial" w:eastAsia="Arial" w:hAnsi="Arial"/>
+          <w:b/>
+          <w:bCs/>
+          <w:sz w:val="24"/>
+          <w:szCs w:val="24"/>
+        </w:rPr>
+        <w:t xml:space="preserve">What’s not a domain: </w:t>
+      </w:r>
+      <w:r>
+        <w:rPr>
+          <w:rFonts w:ascii="Arial" w:cs="Arial" w:eastAsia="Arial" w:hAnsi="Arial"/>
+          <w:sz w:val="24"/>
+          <w:szCs w:val="24"/>
+        </w:rPr>
+        <w:t xml:space="preserve">Mental, learning, spiritual — these are real, but they usually express through one of the three. Meditation is Body. Reading for your craft is Build. Deep conversation is Exposure. Adding a fourth domain means making categorization judgment calls every morning. That’s friction. Three is the maximum number of things you can track without a system to manage the tracking.</w:t>
+      </w:r>
+    </w:p>
+    <w:p>
+      <w:r>
+        <w:br w:type="page"/>
+      </w:r>
+    </w:p>
+    <w:p>
+      <w:pPr>
+        <w:pStyle w:val="Heading1"/>
+      </w:pPr>
+      <w:r>
+        <w:t xml:space="preserve">7. Data &amp; Storage</w:t>
       </w:r>
     </w:p>
     <w:p>
@@ -3007,9 +3192,9 @@
         <w:t xml:space="preserve">{
   "date": "2026-03-03",
   "intent": "Ship the landing page.",
-  "physical": { "task": "Gym - press day", "done": true },
-  "output": { "task": "Finish API endpoints", "done": false },
-  "social": { "task": "Dinner with Alex", "done": true }
+  "body": { "task": "Gym - press day", "done": true },
+  "build": { "task": "Finish API endpoints", "done": false },
+  "exposure": { "task": "Dinner with Alex", "done": true }
 }</w:t>
       </w:r>
     </w:p>
@@ -3046,7 +3231,7 @@
         <w:pStyle w:val="Heading1"/>
       </w:pPr>
       <w:r>
-        <w:t xml:space="preserve">7. Visual Design</w:t>
+        <w:t xml:space="preserve">8. Visual Design</w:t>
       </w:r>
     </w:p>
     <w:p>
@@ -3976,7 +4161,7 @@
         <w:pStyle w:val="Heading1"/>
       </w:pPr>
       <w:r>
-        <w:t xml:space="preserve">8. Navigation</w:t>
+        <w:t xml:space="preserve">9. Navigation</w:t>
       </w:r>
     </w:p>
     <w:p>
@@ -4053,7 +4238,7 @@
         <w:pStyle w:val="Heading1"/>
       </w:pPr>
       <w:r>
-        <w:t xml:space="preserve">9. What Success Looks Like</w:t>
+        <w:t xml:space="preserve">10. What Success Looks Like</w:t>
       </w:r>
     </w:p>
     <w:p>
@@ -4191,7 +4376,7 @@
         <w:pStyle w:val="Heading1"/>
       </w:pPr>
       <w:r>
-        <w:t xml:space="preserve">10. Build Plan</w:t>
+        <w:t xml:space="preserve">11. Build Plan</w:t>
       </w:r>
     </w:p>
     <w:p>
@@ -4951,7 +5136,7 @@
         <w:pStyle w:val="Heading1"/>
       </w:pPr>
       <w:r>
-        <w:t xml:space="preserve">11. What Comes After (Earned Features)</w:t>
+        <w:t xml:space="preserve">12. What Comes After (Earned Features)</w:t>
       </w:r>
     </w:p>
     <w:p>
@@ -5102,6 +5287,62 @@
                 <w:szCs w:val="22"/>
               </w:rPr>
               <w:t xml:space="preserve">3 weeks of daily use (internalize the system first)</w:t>
+            </w:r>
+          </w:p>
+        </w:tc>
+      </w:tr>
+      <w:tr>
+        <w:tc>
+          <w:tcPr>
+            <w:tcW w:type="dxa" w:w="4200"/>
+            <w:tcBorders>
+              <w:top w:val="single" w:color="CCCCCC" w:sz="1"/>
+              <w:left w:val="single" w:color="CCCCCC" w:sz="1"/>
+              <w:bottom w:val="single" w:color="CCCCCC" w:sz="1"/>
+              <w:right w:val="single" w:color="CCCCCC" w:sz="1"/>
+            </w:tcBorders>
+            <w:tcMar>
+              <w:top w:type="dxa" w:w="80"/>
+              <w:left w:type="dxa" w:w="120"/>
+              <w:bottom w:type="dxa" w:w="80"/>
+              <w:right w:type="dxa" w:w="120"/>
+            </w:tcMar>
+          </w:tcPr>
+          <w:p>
+            <w:r>
+              <w:rPr>
+                <w:rFonts w:ascii="Arial" w:cs="Arial" w:eastAsia="Arial" w:hAnsi="Arial"/>
+                <w:sz w:val="22"/>
+                <w:szCs w:val="22"/>
+              </w:rPr>
+              <w:t xml:space="preserve">Weekly reflection prompt (single text field on velocity screen)</w:t>
+            </w:r>
+          </w:p>
+        </w:tc>
+        <w:tc>
+          <w:tcPr>
+            <w:tcW w:type="dxa" w:w="5160"/>
+            <w:tcBorders>
+              <w:top w:val="single" w:color="CCCCCC" w:sz="1"/>
+              <w:left w:val="single" w:color="CCCCCC" w:sz="1"/>
+              <w:bottom w:val="single" w:color="CCCCCC" w:sz="1"/>
+              <w:right w:val="single" w:color="CCCCCC" w:sz="1"/>
+            </w:tcBorders>
+            <w:tcMar>
+              <w:top w:type="dxa" w:w="80"/>
+              <w:left w:type="dxa" w:w="120"/>
+              <w:bottom w:type="dxa" w:w="80"/>
+              <w:right w:type="dxa" w:w="120"/>
+            </w:tcMar>
+          </w:tcPr>
+          <w:p>
+            <w:r>
+              <w:rPr>
+                <w:rFonts w:ascii="Arial" w:cs="Arial" w:eastAsia="Arial" w:hAnsi="Arial"/>
+                <w:sz w:val="22"/>
+                <w:szCs w:val="22"/>
+              </w:rPr>
+              <w:t xml:space="preserve">3 weeks of daily use (prove you reflect naturally first)</w:t>
             </w:r>
           </w:p>
         </w:tc>

</xml_diff>